<commit_message>
Wave 1 integration: suite green, renames, CTO title
Fix tests where the parallel wave-1 tickets met, rename the three
role people to Ammar Khan, Akbar Ali and Anthony Fernandes, and
rename the dummy job title "R&D lead" to CTO. 410 tests pass.

Co-Authored-By: Claude Opus 5.5 <noreply@anthropic.com>
</commit_message>
<xml_diff>
--- a/company_data/brain_sources/docx/SRC15.docx
+++ b/company_data/brain_sources/docx/SRC15.docx
@@ -4,7 +4,7 @@
   <w:body>
     <w:p>
       <w:r>
-        <w:t xml:space="preserve">Retro notes, MedBridge Patient Booking App</w:t>
+        <w:t xml:space="preserve">Retro notes, MedBridge Patient App</w:t>
       </w:r>
     </w:p>
     <w:p>
@@ -14,12 +14,22 @@
     </w:p>
     <w:p>
       <w:r>
-        <w:t xml:space="preserve">What changed late: insurance claim upload, WhatsApp reminders and Hindi screens.</w:t>
+        <w:t xml:space="preserve">What changed late: insurance claim upload.</w:t>
       </w:r>
     </w:p>
     <w:p>
       <w:r>
-        <w:t xml:space="preserve">Next time we ask about claims, reminders and language at kickoff.</w:t>
+        <w:t xml:space="preserve">What changed late: WhatsApp reminders.</w:t>
+      </w:r>
+    </w:p>
+    <w:p>
+      <w:r>
+        <w:t xml:space="preserve">What changed late: Hindi screens.</w:t>
+      </w:r>
+    </w:p>
+    <w:p>
+      <w:r>
+        <w:t xml:space="preserve">Next time we ask these three questions at kickoff.</w:t>
       </w:r>
     </w:p>
   </w:body>

</xml_diff>